<commit_message>
Update HR training for shipped controls
</commit_message>
<xml_diff>
--- a/docs/training/Anata-Employee-HR-Quick-Start.docx
+++ b/docs/training/Anata-Employee-HR-Quick-Start.docx
@@ -117,6 +117,9 @@
             </w:r>
           </w:p>
         </w:tc>
+        <w:trPr>
+          <w:tblHeader/>
+        </w:trPr>
       </w:tr>
     </w:tbl>
     <w:p>
@@ -300,7 +303,57 @@
         <w:pStyle w:val="Heading1"/>
       </w:pPr>
       <w:r>
-        <w:t>3. Request PTO</w:t>
+        <w:t>3. Submit your timesheet</w:t>
+      </w:r>
+    </w:p>
+    <w:p>
+      <w:pPr>
+        <w:pStyle w:val="Heading2"/>
+      </w:pPr>
+      <w:r>
+        <w:t>1. Review the pay period</w:t>
+      </w:r>
+    </w:p>
+    <w:p>
+      <w:pPr/>
+      <w:r>
+        <w:t>Confirm every workday is present, every punch is closed, and any correction request has been resolved.</w:t>
+      </w:r>
+    </w:p>
+    <w:p>
+      <w:pPr>
+        <w:pStyle w:val="Heading2"/>
+      </w:pPr>
+      <w:r>
+        <w:t>2. Sign and submit</w:t>
+      </w:r>
+    </w:p>
+    <w:p>
+      <w:pPr/>
+      <w:r>
+        <w:t>Confirm the timesheet is complete and accurate, then submit it. Another authorized person must approve it before payroll can be prepared.</w:t>
+      </w:r>
+    </w:p>
+    <w:p>
+      <w:pPr>
+        <w:pStyle w:val="Heading2"/>
+      </w:pPr>
+      <w:r>
+        <w:t>3. Resubmit after changes</w:t>
+      </w:r>
+    </w:p>
+    <w:p>
+      <w:pPr/>
+      <w:r>
+        <w:t>If approved time later changes, the approval becomes stale. Review the corrected time and submit the period again.</w:t>
+      </w:r>
+    </w:p>
+    <w:p>
+      <w:pPr>
+        <w:pStyle w:val="Heading1"/>
+      </w:pPr>
+      <w:r>
+        <w:t>4. Request PTO</w:t>
       </w:r>
     </w:p>
     <w:p>
@@ -377,7 +430,7 @@
         <w:pStyle w:val="Heading1"/>
       </w:pPr>
       <w:r>
-        <w:t>4. View your pay statement</w:t>
+        <w:t>5. View your pay statement</w:t>
       </w:r>
     </w:p>
     <w:p>
@@ -410,6 +463,26 @@
       </w:pPr>
       <w:r>
         <w:t>If anything is wrong, tell David or Val immediately; do not email sensitive tax or identity information.</w:t>
+      </w:r>
+    </w:p>
+    <w:p>
+      <w:pPr>
+        <w:pStyle w:val="Heading1"/>
+      </w:pPr>
+      <w:r>
+        <w:t>6. Use HR on your phone</w:t>
+      </w:r>
+    </w:p>
+    <w:p>
+      <w:pPr/>
+      <w:r>
+        <w:t>Use the bottom shortcuts: Home for open tasks, Time for clocking and PTO, Pay for issued statements, and Profile for onboarding and secure forms.</w:t>
+      </w:r>
+    </w:p>
+    <w:p>
+      <w:pPr/>
+      <w:r>
+        <w:t>Tables scroll sideways inside the record when needed. Your full Social Security number and sealed tax form are never displayed in those tables or downloads.</w:t>
       </w:r>
     </w:p>
     <w:p>
@@ -490,6 +563,9 @@
             </w:r>
           </w:p>
         </w:tc>
+        <w:trPr>
+          <w:tblHeader/>
+        </w:trPr>
       </w:tr>
       <w:tr>
         <w:tc>
@@ -888,6 +964,9 @@
             </w:r>
           </w:p>
         </w:tc>
+        <w:trPr>
+          <w:tblHeader/>
+        </w:trPr>
       </w:tr>
     </w:tbl>
     <w:p>
@@ -1663,9 +1742,6 @@
     <w:qFormat/>
     <w:rsid w:val="00FC693F"/>
     <w:pPr>
-      <w:pBdr>
-        <w:bottom w:val="single" w:sz="8" w:space="4" w:color="4F81BD" w:themeColor="accent1"/>
-      </w:pBdr>
       <w:spacing w:after="300" w:line="240" w:lineRule="auto"/>
       <w:contextualSpacing/>
     </w:pPr>

</xml_diff>

<commit_message>
Complete handbook parity from HR reference
</commit_message>
<xml_diff>
--- a/docs/training/Anata-Employee-HR-Quick-Start.docx
+++ b/docs/training/Anata-Employee-HR-Quick-Start.docx
@@ -483,6 +483,26 @@
       <w:pPr/>
       <w:r>
         <w:t>Tables scroll sideways inside the record when needed. Your full Social Security number and sealed tax form are never displayed in those tables or downloads.</w:t>
+      </w:r>
+    </w:p>
+    <w:p>
+      <w:pPr>
+        <w:pStyle w:val="Heading1"/>
+      </w:pPr>
+      <w:r>
+        <w:t>7. Read and acknowledge the current handbook</w:t>
+      </w:r>
+    </w:p>
+    <w:p>
+      <w:pPr/>
+      <w:r>
+        <w:t>Open Policies, select Open handbook securely, and read the complete current version. Return to HR and acknowledge only after you have read that exact version.</w:t>
+      </w:r>
+    </w:p>
+    <w:p>
+      <w:pPr/>
+      <w:r>
+        <w:t>A new handbook version requires a new acknowledgement. If the link is unavailable or the document appears different from the version shown in HR, stop and tell David or Val.</w:t>
       </w:r>
     </w:p>
     <w:p>

</xml_diff>

<commit_message>
Refresh HR access training guides
</commit_message>
<xml_diff>
--- a/docs/training/Anata-Employee-HR-Quick-Start.docx
+++ b/docs/training/Anata-Employee-HR-Quick-Start.docx
@@ -106,14 +106,7 @@
               <w:spacing w:after="0"/>
             </w:pPr>
             <w:r>
-              <w:rPr>
-                <w:rFonts w:ascii="Aptos" w:hAnsi="Aptos"/>
-                <w:b w:val="0"/>
-                <w:i w:val="0"/>
-                <w:color w:val="2B3644"/>
-                <w:sz w:val="21"/>
-              </w:rPr>
-              <w:t>Your invitation is tied to your work email. Do not forward it. David or Val will never ask you to email your Social Security number or identity documents.</w:t>
+              <w:t>Your invitation is tied to your personal HR sign-in email. Do not forward it. David or Val will never ask you to email your Social Security number or identity documents.</w:t>
             </w:r>
           </w:p>
         </w:tc>
@@ -155,7 +148,7 @@
         <w:ind w:left="259"/>
       </w:pPr>
       <w:r>
-        <w:t>Use the link sent by Val or David and sign in with the same work email listed on your employee record.</w:t>
+        <w:t>Open the one-time link sent by Val or David to your personal HR sign-in email. Gmail, Yahoo, Outlook, iCloud, and other valid addresses work. You do not need a Google account or a new password, and your work login remains separate.</w:t>
       </w:r>
     </w:p>
     <w:p>
@@ -687,14 +680,7 @@
               <w:spacing w:after="0"/>
             </w:pPr>
             <w:r>
-              <w:rPr>
-                <w:rFonts w:ascii="Aptos" w:hAnsi="Aptos"/>
-                <w:b w:val="0"/>
-                <w:i w:val="0"/>
-                <w:color w:val="2B3644"/>
-                <w:sz w:val="18"/>
-              </w:rPr>
-              <w:t>Confirm you signed in with the exact work email used for your employee record.</w:t>
+              <w:t>Confirm you used the exact personal HR sign-in email where your invitation was sent.</w:t>
             </w:r>
           </w:p>
         </w:tc>

</xml_diff>